<commit_message>
Update manuals and YAML configuration docs
</commit_message>
<xml_diff>
--- a/documentation/manuals/AdminManual.docx
+++ b/documentation/manuals/AdminManual.docx
@@ -878,7 +878,7 @@
         <w:pStyle w:val="FirstParagraph"/>
       </w:pPr>
       <w:r>
-        <w:t>Trainers can adjust reservation times when a change is needed.</w:t>
+        <w:t>Admins can adjust reservation times when a change is needed.</w:t>
       </w:r>
     </w:p>
     <w:p>
@@ -1171,7 +1171,7 @@
         <w:pStyle w:val="FirstParagraph"/>
       </w:pPr>
       <w:r>
-        <w:t>If a reservation must be removed, trainers can delete it from the reservation view.</w:t>
+        <w:t>If a reservation must be removed, admins can delete it from the reservation view.</w:t>
       </w:r>
     </w:p>
     <w:p>

</xml_diff>